<commit_message>
changes3: updated mpaStructure.xlsx and mpatemplate.june-2026.docx to reflect new MPA structure and template updates. Added backup of mpaStructure.xlsx for reference.
</commit_message>
<xml_diff>
--- a/server/mpatemplate.june-2026.docx
+++ b/server/mpatemplate.june-2026.docx
@@ -25,18 +25,7 @@
           <w:szCs w:val="26"/>
           <w:lang w:val="en-US"/>
         </w:rPr>
-        <w:t xml:space="preserve">ZONE: </w:t>
-      </w:r>
-      <w:r>
-        <w:rPr>
-          <w:rFonts w:ascii="Arial Narrow" w:hAnsi="Arial Narrow"/>
-          <w:b/>
-          <w:bCs/>
-          <w:sz w:val="26"/>
-          <w:szCs w:val="26"/>
-          <w:lang w:val="en-US"/>
-        </w:rPr>
-        <w:t>{{</w:t>
+        <w:t>ZONE: {{</w:t>
       </w:r>
       <w:proofErr w:type="gramEnd"/>
       <w:r>
@@ -76,12 +65,20 @@
         </w:rPr>
       </w:pPr>
       <w:r>
+        <w:rPr>
+          <w:rFonts w:ascii="Arial Narrow" w:hAnsi="Arial Narrow"/>
+          <w:sz w:val="26"/>
+          <w:szCs w:val="26"/>
+        </w:rPr>
         <w:t xml:space="preserve">BRANCH NO: </w:t>
       </w:r>
       <w:r>
         <w:rPr>
+          <w:rFonts w:ascii="Arial Narrow" w:hAnsi="Arial Narrow"/>
           <w:b/>
           <w:bCs/>
+          <w:sz w:val="26"/>
+          <w:szCs w:val="26"/>
         </w:rPr>
         <w:t>{{zone_branch_count}}</w:t>
       </w:r>
@@ -100,12 +97,20 @@
         </w:rPr>
       </w:pPr>
       <w:r>
+        <w:rPr>
+          <w:rFonts w:ascii="Arial Narrow" w:hAnsi="Arial Narrow"/>
+          <w:sz w:val="26"/>
+          <w:szCs w:val="26"/>
+        </w:rPr>
         <w:t xml:space="preserve">ZONAL HEAD: </w:t>
       </w:r>
       <w:r>
         <w:rPr>
+          <w:rFonts w:ascii="Arial Narrow" w:hAnsi="Arial Narrow"/>
           <w:b/>
           <w:bCs/>
+          <w:sz w:val="26"/>
+          <w:szCs w:val="26"/>
         </w:rPr>
         <w:t>{{ZONAL_HEAD_NAME}}</w:t>
       </w:r>
@@ -181,14 +186,20 @@
           <w:p>
             <w:pPr>
               <w:rPr>
-                <w:b/>
-                <w:bCs/>
-              </w:rPr>
-            </w:pPr>
-            <w:r>
-              <w:rPr>
-                <w:b/>
-                <w:bCs/>
+                <w:rFonts w:ascii="Arial Narrow" w:hAnsi="Arial Narrow"/>
+                <w:b/>
+                <w:bCs/>
+                <w:sz w:val="26"/>
+                <w:szCs w:val="26"/>
+              </w:rPr>
+            </w:pPr>
+            <w:r>
+              <w:rPr>
+                <w:rFonts w:ascii="Arial Narrow" w:hAnsi="Arial Narrow"/>
+                <w:b/>
+                <w:bCs/>
+                <w:sz w:val="26"/>
+                <w:szCs w:val="26"/>
               </w:rPr>
               <w:t>2026 YTD ACHIEVED</w:t>
             </w:r>
@@ -211,14 +222,20 @@
           <w:p>
             <w:pPr>
               <w:rPr>
-                <w:b/>
-                <w:bCs/>
-              </w:rPr>
-            </w:pPr>
-            <w:r>
-              <w:rPr>
-                <w:b/>
-                <w:bCs/>
+                <w:rFonts w:ascii="Arial Narrow" w:hAnsi="Arial Narrow"/>
+                <w:b/>
+                <w:bCs/>
+                <w:sz w:val="26"/>
+                <w:szCs w:val="26"/>
+              </w:rPr>
+            </w:pPr>
+            <w:r>
+              <w:rPr>
+                <w:rFonts w:ascii="Arial Narrow" w:hAnsi="Arial Narrow"/>
+                <w:b/>
+                <w:bCs/>
+                <w:sz w:val="26"/>
+                <w:szCs w:val="26"/>
               </w:rPr>
               <w:t>2026 FULL BUDGET</w:t>
             </w:r>
@@ -241,14 +258,20 @@
           <w:p>
             <w:pPr>
               <w:rPr>
-                <w:b/>
-                <w:bCs/>
-              </w:rPr>
-            </w:pPr>
-            <w:r>
-              <w:rPr>
-                <w:b/>
-                <w:bCs/>
+                <w:rFonts w:ascii="Arial Narrow" w:hAnsi="Arial Narrow"/>
+                <w:b/>
+                <w:bCs/>
+                <w:sz w:val="26"/>
+                <w:szCs w:val="26"/>
+              </w:rPr>
+            </w:pPr>
+            <w:r>
+              <w:rPr>
+                <w:rFonts w:ascii="Arial Narrow" w:hAnsi="Arial Narrow"/>
+                <w:b/>
+                <w:bCs/>
+                <w:sz w:val="26"/>
+                <w:szCs w:val="26"/>
               </w:rPr>
               <w:t>% ON BUDGET</w:t>
             </w:r>
@@ -271,14 +294,20 @@
           <w:p>
             <w:pPr>
               <w:rPr>
-                <w:b/>
-                <w:bCs/>
-              </w:rPr>
-            </w:pPr>
-            <w:r>
-              <w:rPr>
-                <w:b/>
-                <w:bCs/>
+                <w:rFonts w:ascii="Arial Narrow" w:hAnsi="Arial Narrow"/>
+                <w:b/>
+                <w:bCs/>
+                <w:sz w:val="26"/>
+                <w:szCs w:val="26"/>
+              </w:rPr>
+            </w:pPr>
+            <w:r>
+              <w:rPr>
+                <w:rFonts w:ascii="Arial Narrow" w:hAnsi="Arial Narrow"/>
+                <w:b/>
+                <w:bCs/>
+                <w:sz w:val="26"/>
+                <w:szCs w:val="26"/>
               </w:rPr>
               <w:t>YOY VARIANCE</w:t>
             </w:r>
@@ -301,14 +330,20 @@
           <w:p>
             <w:pPr>
               <w:rPr>
-                <w:b/>
-                <w:bCs/>
-              </w:rPr>
-            </w:pPr>
-            <w:r>
-              <w:rPr>
-                <w:b/>
-                <w:bCs/>
+                <w:rFonts w:ascii="Arial Narrow" w:hAnsi="Arial Narrow"/>
+                <w:b/>
+                <w:bCs/>
+                <w:sz w:val="26"/>
+                <w:szCs w:val="26"/>
+              </w:rPr>
+            </w:pPr>
+            <w:r>
+              <w:rPr>
+                <w:rFonts w:ascii="Arial Narrow" w:hAnsi="Arial Narrow"/>
+                <w:b/>
+                <w:bCs/>
+                <w:sz w:val="26"/>
+                <w:szCs w:val="26"/>
               </w:rPr>
               <w:t>RUN RATE</w:t>
             </w:r>
@@ -334,7 +369,19 @@
             </w:tcMar>
           </w:tcPr>
           <w:p>
-            <w:r>
+            <w:pPr>
+              <w:rPr>
+                <w:rFonts w:ascii="Arial Narrow" w:hAnsi="Arial Narrow"/>
+                <w:sz w:val="26"/>
+                <w:szCs w:val="26"/>
+              </w:rPr>
+            </w:pPr>
+            <w:r>
+              <w:rPr>
+                <w:rFonts w:ascii="Arial Narrow" w:hAnsi="Arial Narrow"/>
+                <w:sz w:val="26"/>
+                <w:szCs w:val="26"/>
+              </w:rPr>
               <w:t>{{PBT_value1}}</w:t>
             </w:r>
           </w:p>
@@ -354,7 +401,19 @@
             </w:tcMar>
           </w:tcPr>
           <w:p>
-            <w:r>
+            <w:pPr>
+              <w:rPr>
+                <w:rFonts w:ascii="Arial Narrow" w:hAnsi="Arial Narrow"/>
+                <w:sz w:val="26"/>
+                <w:szCs w:val="26"/>
+              </w:rPr>
+            </w:pPr>
+            <w:r>
+              <w:rPr>
+                <w:rFonts w:ascii="Arial Narrow" w:hAnsi="Arial Narrow"/>
+                <w:sz w:val="26"/>
+                <w:szCs w:val="26"/>
+              </w:rPr>
               <w:t>{{PBT_value2}}</w:t>
             </w:r>
           </w:p>
@@ -374,9 +433,31 @@
             </w:tcMar>
           </w:tcPr>
           <w:p>
-            <w:r>
-              <w:t>{{PBT_value3}}%</w:t>
-            </w:r>
+            <w:pPr>
+              <w:rPr>
+                <w:rFonts w:ascii="Arial Narrow" w:hAnsi="Arial Narrow"/>
+                <w:sz w:val="26"/>
+                <w:szCs w:val="26"/>
+              </w:rPr>
+            </w:pPr>
+            <w:r>
+              <w:rPr>
+                <w:rFonts w:ascii="Arial Narrow" w:hAnsi="Arial Narrow"/>
+                <w:sz w:val="26"/>
+                <w:szCs w:val="26"/>
+              </w:rPr>
+              <w:t>{{PBT_value3</w:t>
+            </w:r>
+            <w:proofErr w:type="gramStart"/>
+            <w:r>
+              <w:rPr>
+                <w:rFonts w:ascii="Arial Narrow" w:hAnsi="Arial Narrow"/>
+                <w:sz w:val="26"/>
+                <w:szCs w:val="26"/>
+              </w:rPr>
+              <w:t>}}%</w:t>
+            </w:r>
+            <w:proofErr w:type="gramEnd"/>
           </w:p>
         </w:tc>
         <w:tc>
@@ -394,7 +475,19 @@
             </w:tcMar>
           </w:tcPr>
           <w:p>
-            <w:r>
+            <w:pPr>
+              <w:rPr>
+                <w:rFonts w:ascii="Arial Narrow" w:hAnsi="Arial Narrow"/>
+                <w:sz w:val="26"/>
+                <w:szCs w:val="26"/>
+              </w:rPr>
+            </w:pPr>
+            <w:r>
+              <w:rPr>
+                <w:rFonts w:ascii="Arial Narrow" w:hAnsi="Arial Narrow"/>
+                <w:sz w:val="26"/>
+                <w:szCs w:val="26"/>
+              </w:rPr>
               <w:t>{{r PBT_value4_r}}</w:t>
             </w:r>
           </w:p>
@@ -414,7 +507,19 @@
             </w:tcMar>
           </w:tcPr>
           <w:p>
-            <w:r>
+            <w:pPr>
+              <w:rPr>
+                <w:rFonts w:ascii="Arial Narrow" w:hAnsi="Arial Narrow"/>
+                <w:sz w:val="26"/>
+                <w:szCs w:val="26"/>
+              </w:rPr>
+            </w:pPr>
+            <w:r>
+              <w:rPr>
+                <w:rFonts w:ascii="Arial Narrow" w:hAnsi="Arial Narrow"/>
+                <w:sz w:val="26"/>
+                <w:szCs w:val="26"/>
+              </w:rPr>
               <w:t>{{PBT_value5}}</w:t>
             </w:r>
           </w:p>
@@ -437,6 +542,11 @@
         </w:rPr>
       </w:pPr>
       <w:r>
+        <w:rPr>
+          <w:rFonts w:ascii="Arial Narrow" w:hAnsi="Arial Narrow"/>
+          <w:sz w:val="26"/>
+          <w:szCs w:val="26"/>
+        </w:rPr>
         <w:t>{{PBT_summary_1}}</w:t>
       </w:r>
     </w:p>
@@ -456,6 +566,11 @@
         </w:rPr>
       </w:pPr>
       <w:r>
+        <w:rPr>
+          <w:rFonts w:ascii="Arial Narrow" w:hAnsi="Arial Narrow"/>
+          <w:sz w:val="26"/>
+          <w:szCs w:val="26"/>
+        </w:rPr>
         <w:t>{{PBT_summary_2}}</w:t>
       </w:r>
     </w:p>
@@ -475,6 +590,11 @@
         </w:rPr>
       </w:pPr>
       <w:r>
+        <w:rPr>
+          <w:rFonts w:ascii="Arial Narrow" w:hAnsi="Arial Narrow"/>
+          <w:sz w:val="26"/>
+          <w:szCs w:val="26"/>
+        </w:rPr>
         <w:t>{{PBT_summary_3}}</w:t>
       </w:r>
     </w:p>
@@ -549,14 +669,20 @@
           <w:p>
             <w:pPr>
               <w:rPr>
-                <w:b/>
-                <w:bCs/>
-              </w:rPr>
-            </w:pPr>
-            <w:r>
-              <w:rPr>
-                <w:b/>
-                <w:bCs/>
+                <w:rFonts w:ascii="Arial Narrow" w:hAnsi="Arial Narrow"/>
+                <w:b/>
+                <w:bCs/>
+                <w:sz w:val="26"/>
+                <w:szCs w:val="26"/>
+              </w:rPr>
+            </w:pPr>
+            <w:r>
+              <w:rPr>
+                <w:rFonts w:ascii="Arial Narrow" w:hAnsi="Arial Narrow"/>
+                <w:b/>
+                <w:bCs/>
+                <w:sz w:val="26"/>
+                <w:szCs w:val="26"/>
               </w:rPr>
               <w:t>{{PERIOD_MONTH_1}}</w:t>
             </w:r>
@@ -579,14 +705,20 @@
           <w:p>
             <w:pPr>
               <w:rPr>
-                <w:b/>
-                <w:bCs/>
-              </w:rPr>
-            </w:pPr>
-            <w:r>
-              <w:rPr>
-                <w:b/>
-                <w:bCs/>
+                <w:rFonts w:ascii="Arial Narrow" w:hAnsi="Arial Narrow"/>
+                <w:b/>
+                <w:bCs/>
+                <w:sz w:val="26"/>
+                <w:szCs w:val="26"/>
+              </w:rPr>
+            </w:pPr>
+            <w:r>
+              <w:rPr>
+                <w:rFonts w:ascii="Arial Narrow" w:hAnsi="Arial Narrow"/>
+                <w:b/>
+                <w:bCs/>
+                <w:sz w:val="26"/>
+                <w:szCs w:val="26"/>
               </w:rPr>
               <w:t>{{PERIOD_MONTH_2}}</w:t>
             </w:r>
@@ -609,14 +741,20 @@
           <w:p>
             <w:pPr>
               <w:rPr>
-                <w:b/>
-                <w:bCs/>
-              </w:rPr>
-            </w:pPr>
-            <w:r>
-              <w:rPr>
-                <w:b/>
-                <w:bCs/>
+                <w:rFonts w:ascii="Arial Narrow" w:hAnsi="Arial Narrow"/>
+                <w:b/>
+                <w:bCs/>
+                <w:sz w:val="26"/>
+                <w:szCs w:val="26"/>
+              </w:rPr>
+            </w:pPr>
+            <w:r>
+              <w:rPr>
+                <w:rFonts w:ascii="Arial Narrow" w:hAnsi="Arial Narrow"/>
+                <w:b/>
+                <w:bCs/>
+                <w:sz w:val="26"/>
+                <w:szCs w:val="26"/>
               </w:rPr>
               <w:t>{{PERIOD_MONTH_3}}</w:t>
             </w:r>
@@ -639,14 +777,20 @@
           <w:p>
             <w:pPr>
               <w:rPr>
-                <w:b/>
-                <w:bCs/>
-              </w:rPr>
-            </w:pPr>
-            <w:r>
-              <w:rPr>
-                <w:b/>
-                <w:bCs/>
+                <w:rFonts w:ascii="Arial Narrow" w:hAnsi="Arial Narrow"/>
+                <w:b/>
+                <w:bCs/>
+                <w:sz w:val="26"/>
+                <w:szCs w:val="26"/>
+              </w:rPr>
+            </w:pPr>
+            <w:r>
+              <w:rPr>
+                <w:rFonts w:ascii="Arial Narrow" w:hAnsi="Arial Narrow"/>
+                <w:b/>
+                <w:bCs/>
+                <w:sz w:val="26"/>
+                <w:szCs w:val="26"/>
               </w:rPr>
               <w:t>%ACHIEVED</w:t>
             </w:r>
@@ -669,14 +813,20 @@
           <w:p>
             <w:pPr>
               <w:rPr>
-                <w:b/>
-                <w:bCs/>
-              </w:rPr>
-            </w:pPr>
-            <w:r>
-              <w:rPr>
-                <w:b/>
-                <w:bCs/>
+                <w:rFonts w:ascii="Arial Narrow" w:hAnsi="Arial Narrow"/>
+                <w:b/>
+                <w:bCs/>
+                <w:sz w:val="26"/>
+                <w:szCs w:val="26"/>
+              </w:rPr>
+            </w:pPr>
+            <w:r>
+              <w:rPr>
+                <w:rFonts w:ascii="Arial Narrow" w:hAnsi="Arial Narrow"/>
+                <w:b/>
+                <w:bCs/>
+                <w:sz w:val="26"/>
+                <w:szCs w:val="26"/>
               </w:rPr>
               <w:t>YTD VARIANCE</w:t>
             </w:r>
@@ -705,14 +855,20 @@
           <w:p>
             <w:pPr>
               <w:rPr>
-                <w:b/>
-                <w:bCs/>
-              </w:rPr>
-            </w:pPr>
-            <w:r>
-              <w:rPr>
-                <w:b/>
-                <w:bCs/>
+                <w:rFonts w:ascii="Arial Narrow" w:hAnsi="Arial Narrow"/>
+                <w:b/>
+                <w:bCs/>
+                <w:sz w:val="26"/>
+                <w:szCs w:val="26"/>
+              </w:rPr>
+            </w:pPr>
+            <w:r>
+              <w:rPr>
+                <w:rFonts w:ascii="Arial Narrow" w:hAnsi="Arial Narrow"/>
+                <w:b/>
+                <w:bCs/>
+                <w:sz w:val="26"/>
+                <w:szCs w:val="26"/>
               </w:rPr>
               <w:t>{{DDA_value1}}</w:t>
             </w:r>
@@ -736,14 +892,20 @@
           <w:p>
             <w:pPr>
               <w:rPr>
-                <w:b/>
-                <w:bCs/>
-              </w:rPr>
-            </w:pPr>
-            <w:r>
-              <w:rPr>
-                <w:b/>
-                <w:bCs/>
+                <w:rFonts w:ascii="Arial Narrow" w:hAnsi="Arial Narrow"/>
+                <w:b/>
+                <w:bCs/>
+                <w:sz w:val="26"/>
+                <w:szCs w:val="26"/>
+              </w:rPr>
+            </w:pPr>
+            <w:r>
+              <w:rPr>
+                <w:rFonts w:ascii="Arial Narrow" w:hAnsi="Arial Narrow"/>
+                <w:b/>
+                <w:bCs/>
+                <w:sz w:val="26"/>
+                <w:szCs w:val="26"/>
               </w:rPr>
               <w:t>{{r DDA_value2_r}}</w:t>
             </w:r>
@@ -767,14 +929,20 @@
           <w:p>
             <w:pPr>
               <w:rPr>
-                <w:b/>
-                <w:bCs/>
-              </w:rPr>
-            </w:pPr>
-            <w:r>
-              <w:rPr>
-                <w:b/>
-                <w:bCs/>
+                <w:rFonts w:ascii="Arial Narrow" w:hAnsi="Arial Narrow"/>
+                <w:b/>
+                <w:bCs/>
+                <w:sz w:val="26"/>
+                <w:szCs w:val="26"/>
+              </w:rPr>
+            </w:pPr>
+            <w:r>
+              <w:rPr>
+                <w:rFonts w:ascii="Arial Narrow" w:hAnsi="Arial Narrow"/>
+                <w:b/>
+                <w:bCs/>
+                <w:sz w:val="26"/>
+                <w:szCs w:val="26"/>
               </w:rPr>
               <w:t>{{r DDA_value3_r}}</w:t>
             </w:r>
@@ -795,11 +963,28 @@
             </w:tcMar>
           </w:tcPr>
           <w:p>
-            <w:r>
+            <w:pPr>
+              <w:rPr>
+                <w:rFonts w:ascii="Arial Narrow" w:hAnsi="Arial Narrow"/>
+                <w:sz w:val="26"/>
+                <w:szCs w:val="26"/>
+              </w:rPr>
+            </w:pPr>
+            <w:r>
+              <w:rPr>
+                <w:rFonts w:ascii="Arial Narrow" w:hAnsi="Arial Narrow"/>
+                <w:sz w:val="26"/>
+                <w:szCs w:val="26"/>
+              </w:rPr>
               <w:t>{{DDA_value4</w:t>
             </w:r>
             <w:proofErr w:type="gramStart"/>
             <w:r>
+              <w:rPr>
+                <w:rFonts w:ascii="Arial Narrow" w:hAnsi="Arial Narrow"/>
+                <w:sz w:val="26"/>
+                <w:szCs w:val="26"/>
+              </w:rPr>
               <w:t>}}%</w:t>
             </w:r>
             <w:proofErr w:type="gramEnd"/>
@@ -820,7 +1005,19 @@
             </w:tcMar>
           </w:tcPr>
           <w:p>
-            <w:r>
+            <w:pPr>
+              <w:rPr>
+                <w:rFonts w:ascii="Arial Narrow" w:hAnsi="Arial Narrow"/>
+                <w:sz w:val="26"/>
+                <w:szCs w:val="26"/>
+              </w:rPr>
+            </w:pPr>
+            <w:r>
+              <w:rPr>
+                <w:rFonts w:ascii="Arial Narrow" w:hAnsi="Arial Narrow"/>
+                <w:sz w:val="26"/>
+                <w:szCs w:val="26"/>
+              </w:rPr>
               <w:t>{{r DDA_value5_r}}</w:t>
             </w:r>
           </w:p>
@@ -843,6 +1040,11 @@
         </w:rPr>
       </w:pPr>
       <w:r>
+        <w:rPr>
+          <w:rFonts w:ascii="Arial Narrow" w:hAnsi="Arial Narrow"/>
+          <w:sz w:val="26"/>
+          <w:szCs w:val="26"/>
+        </w:rPr>
         <w:t>{{DDA_summary_1}}</w:t>
       </w:r>
     </w:p>
@@ -862,6 +1064,11 @@
         </w:rPr>
       </w:pPr>
       <w:r>
+        <w:rPr>
+          <w:rFonts w:ascii="Arial Narrow" w:hAnsi="Arial Narrow"/>
+          <w:sz w:val="26"/>
+          <w:szCs w:val="26"/>
+        </w:rPr>
         <w:t>{{DDA_summary_2}}</w:t>
       </w:r>
     </w:p>
@@ -945,14 +1152,20 @@
           <w:p>
             <w:pPr>
               <w:rPr>
-                <w:b/>
-                <w:bCs/>
-              </w:rPr>
-            </w:pPr>
-            <w:r>
-              <w:rPr>
-                <w:b/>
-                <w:bCs/>
+                <w:rFonts w:ascii="Arial Narrow" w:hAnsi="Arial Narrow"/>
+                <w:b/>
+                <w:bCs/>
+                <w:sz w:val="26"/>
+                <w:szCs w:val="26"/>
+              </w:rPr>
+            </w:pPr>
+            <w:r>
+              <w:rPr>
+                <w:rFonts w:ascii="Arial Narrow" w:hAnsi="Arial Narrow"/>
+                <w:b/>
+                <w:bCs/>
+                <w:sz w:val="26"/>
+                <w:szCs w:val="26"/>
               </w:rPr>
               <w:t>{{PERIOD_MONTH_1}}</w:t>
             </w:r>
@@ -975,14 +1188,20 @@
           <w:p>
             <w:pPr>
               <w:rPr>
-                <w:b/>
-                <w:bCs/>
-              </w:rPr>
-            </w:pPr>
-            <w:r>
-              <w:rPr>
-                <w:b/>
-                <w:bCs/>
+                <w:rFonts w:ascii="Arial Narrow" w:hAnsi="Arial Narrow"/>
+                <w:b/>
+                <w:bCs/>
+                <w:sz w:val="26"/>
+                <w:szCs w:val="26"/>
+              </w:rPr>
+            </w:pPr>
+            <w:r>
+              <w:rPr>
+                <w:rFonts w:ascii="Arial Narrow" w:hAnsi="Arial Narrow"/>
+                <w:b/>
+                <w:bCs/>
+                <w:sz w:val="26"/>
+                <w:szCs w:val="26"/>
               </w:rPr>
               <w:t>{{PERIOD_MONTH_2}}</w:t>
             </w:r>
@@ -1005,14 +1224,20 @@
           <w:p>
             <w:pPr>
               <w:rPr>
-                <w:b/>
-                <w:bCs/>
-              </w:rPr>
-            </w:pPr>
-            <w:r>
-              <w:rPr>
-                <w:b/>
-                <w:bCs/>
+                <w:rFonts w:ascii="Arial Narrow" w:hAnsi="Arial Narrow"/>
+                <w:b/>
+                <w:bCs/>
+                <w:sz w:val="26"/>
+                <w:szCs w:val="26"/>
+              </w:rPr>
+            </w:pPr>
+            <w:r>
+              <w:rPr>
+                <w:rFonts w:ascii="Arial Narrow" w:hAnsi="Arial Narrow"/>
+                <w:b/>
+                <w:bCs/>
+                <w:sz w:val="26"/>
+                <w:szCs w:val="26"/>
               </w:rPr>
               <w:t>{{PERIOD_MONTH_3}}</w:t>
             </w:r>
@@ -1035,14 +1260,20 @@
           <w:p>
             <w:pPr>
               <w:rPr>
-                <w:b/>
-                <w:bCs/>
-              </w:rPr>
-            </w:pPr>
-            <w:r>
-              <w:rPr>
-                <w:b/>
-                <w:bCs/>
+                <w:rFonts w:ascii="Arial Narrow" w:hAnsi="Arial Narrow"/>
+                <w:b/>
+                <w:bCs/>
+                <w:sz w:val="26"/>
+                <w:szCs w:val="26"/>
+              </w:rPr>
+            </w:pPr>
+            <w:r>
+              <w:rPr>
+                <w:rFonts w:ascii="Arial Narrow" w:hAnsi="Arial Narrow"/>
+                <w:b/>
+                <w:bCs/>
+                <w:sz w:val="26"/>
+                <w:szCs w:val="26"/>
               </w:rPr>
               <w:t>%ACHIEVED</w:t>
             </w:r>
@@ -1065,14 +1296,20 @@
           <w:p>
             <w:pPr>
               <w:rPr>
-                <w:b/>
-                <w:bCs/>
-              </w:rPr>
-            </w:pPr>
-            <w:r>
-              <w:rPr>
-                <w:b/>
-                <w:bCs/>
+                <w:rFonts w:ascii="Arial Narrow" w:hAnsi="Arial Narrow"/>
+                <w:b/>
+                <w:bCs/>
+                <w:sz w:val="26"/>
+                <w:szCs w:val="26"/>
+              </w:rPr>
+            </w:pPr>
+            <w:r>
+              <w:rPr>
+                <w:rFonts w:ascii="Arial Narrow" w:hAnsi="Arial Narrow"/>
+                <w:b/>
+                <w:bCs/>
+                <w:sz w:val="26"/>
+                <w:szCs w:val="26"/>
               </w:rPr>
               <w:t>YTD VARIANCE</w:t>
             </w:r>
@@ -1100,14 +1337,20 @@
           <w:p>
             <w:pPr>
               <w:rPr>
-                <w:b/>
-                <w:bCs/>
-              </w:rPr>
-            </w:pPr>
-            <w:r>
-              <w:rPr>
-                <w:b/>
-                <w:bCs/>
+                <w:rFonts w:ascii="Arial Narrow" w:hAnsi="Arial Narrow"/>
+                <w:b/>
+                <w:bCs/>
+                <w:sz w:val="26"/>
+                <w:szCs w:val="26"/>
+              </w:rPr>
+            </w:pPr>
+            <w:r>
+              <w:rPr>
+                <w:rFonts w:ascii="Arial Narrow" w:hAnsi="Arial Narrow"/>
+                <w:b/>
+                <w:bCs/>
+                <w:sz w:val="26"/>
+                <w:szCs w:val="26"/>
               </w:rPr>
               <w:t>{{SAV_value1}}</w:t>
             </w:r>
@@ -1130,14 +1373,20 @@
           <w:p>
             <w:pPr>
               <w:rPr>
-                <w:b/>
-                <w:bCs/>
-              </w:rPr>
-            </w:pPr>
-            <w:r>
-              <w:rPr>
-                <w:b/>
-                <w:bCs/>
+                <w:rFonts w:ascii="Arial Narrow" w:hAnsi="Arial Narrow"/>
+                <w:b/>
+                <w:bCs/>
+                <w:sz w:val="26"/>
+                <w:szCs w:val="26"/>
+              </w:rPr>
+            </w:pPr>
+            <w:r>
+              <w:rPr>
+                <w:rFonts w:ascii="Arial Narrow" w:hAnsi="Arial Narrow"/>
+                <w:b/>
+                <w:bCs/>
+                <w:sz w:val="26"/>
+                <w:szCs w:val="26"/>
               </w:rPr>
               <w:t>{{r SAV_value2_r}}</w:t>
             </w:r>
@@ -1160,14 +1409,20 @@
           <w:p>
             <w:pPr>
               <w:rPr>
-                <w:b/>
-                <w:bCs/>
-              </w:rPr>
-            </w:pPr>
-            <w:r>
-              <w:rPr>
-                <w:b/>
-                <w:bCs/>
+                <w:rFonts w:ascii="Arial Narrow" w:hAnsi="Arial Narrow"/>
+                <w:b/>
+                <w:bCs/>
+                <w:sz w:val="26"/>
+                <w:szCs w:val="26"/>
+              </w:rPr>
+            </w:pPr>
+            <w:r>
+              <w:rPr>
+                <w:rFonts w:ascii="Arial Narrow" w:hAnsi="Arial Narrow"/>
+                <w:b/>
+                <w:bCs/>
+                <w:sz w:val="26"/>
+                <w:szCs w:val="26"/>
               </w:rPr>
               <w:t>{{r SAV_value3_r}}</w:t>
             </w:r>
@@ -1188,11 +1443,28 @@
             </w:tcMar>
           </w:tcPr>
           <w:p>
-            <w:r>
+            <w:pPr>
+              <w:rPr>
+                <w:rFonts w:ascii="Arial Narrow" w:hAnsi="Arial Narrow"/>
+                <w:sz w:val="26"/>
+                <w:szCs w:val="26"/>
+              </w:rPr>
+            </w:pPr>
+            <w:r>
+              <w:rPr>
+                <w:rFonts w:ascii="Arial Narrow" w:hAnsi="Arial Narrow"/>
+                <w:sz w:val="26"/>
+                <w:szCs w:val="26"/>
+              </w:rPr>
               <w:t>{{SAV_value4</w:t>
             </w:r>
             <w:proofErr w:type="gramStart"/>
             <w:r>
+              <w:rPr>
+                <w:rFonts w:ascii="Arial Narrow" w:hAnsi="Arial Narrow"/>
+                <w:sz w:val="26"/>
+                <w:szCs w:val="26"/>
+              </w:rPr>
               <w:t>}}%</w:t>
             </w:r>
             <w:proofErr w:type="gramEnd"/>
@@ -1213,7 +1485,19 @@
             </w:tcMar>
           </w:tcPr>
           <w:p>
-            <w:r>
+            <w:pPr>
+              <w:rPr>
+                <w:rFonts w:ascii="Arial Narrow" w:hAnsi="Arial Narrow"/>
+                <w:sz w:val="26"/>
+                <w:szCs w:val="26"/>
+              </w:rPr>
+            </w:pPr>
+            <w:r>
+              <w:rPr>
+                <w:rFonts w:ascii="Arial Narrow" w:hAnsi="Arial Narrow"/>
+                <w:sz w:val="26"/>
+                <w:szCs w:val="26"/>
+              </w:rPr>
               <w:t>{{r SAV_value5_r}}</w:t>
             </w:r>
           </w:p>
@@ -1236,6 +1520,11 @@
         </w:rPr>
       </w:pPr>
       <w:r>
+        <w:rPr>
+          <w:rFonts w:ascii="Arial Narrow" w:hAnsi="Arial Narrow"/>
+          <w:sz w:val="26"/>
+          <w:szCs w:val="26"/>
+        </w:rPr>
         <w:t>{{SAV_summary_1}}</w:t>
       </w:r>
     </w:p>
@@ -1255,6 +1544,11 @@
         </w:rPr>
       </w:pPr>
       <w:r>
+        <w:rPr>
+          <w:rFonts w:ascii="Arial Narrow" w:hAnsi="Arial Narrow"/>
+          <w:sz w:val="26"/>
+          <w:szCs w:val="26"/>
+        </w:rPr>
         <w:t>{{SAV_summary_2}}</w:t>
       </w:r>
     </w:p>
@@ -1274,6 +1568,11 @@
         </w:rPr>
       </w:pPr>
       <w:r>
+        <w:rPr>
+          <w:rFonts w:ascii="Arial Narrow" w:hAnsi="Arial Narrow"/>
+          <w:sz w:val="26"/>
+          <w:szCs w:val="26"/>
+        </w:rPr>
         <w:t>{{SAV_summary_3}}</w:t>
       </w:r>
     </w:p>
@@ -1348,14 +1647,20 @@
           <w:p>
             <w:pPr>
               <w:rPr>
-                <w:b/>
-                <w:bCs/>
-              </w:rPr>
-            </w:pPr>
-            <w:r>
-              <w:rPr>
-                <w:b/>
-                <w:bCs/>
+                <w:rFonts w:ascii="Arial Narrow" w:hAnsi="Arial Narrow"/>
+                <w:b/>
+                <w:bCs/>
+                <w:sz w:val="26"/>
+                <w:szCs w:val="26"/>
+              </w:rPr>
+            </w:pPr>
+            <w:r>
+              <w:rPr>
+                <w:rFonts w:ascii="Arial Narrow" w:hAnsi="Arial Narrow"/>
+                <w:b/>
+                <w:bCs/>
+                <w:sz w:val="26"/>
+                <w:szCs w:val="26"/>
               </w:rPr>
               <w:t>{{PERIOD_MONTH_1}}</w:t>
             </w:r>
@@ -1378,14 +1683,20 @@
           <w:p>
             <w:pPr>
               <w:rPr>
-                <w:b/>
-                <w:bCs/>
-              </w:rPr>
-            </w:pPr>
-            <w:r>
-              <w:rPr>
-                <w:b/>
-                <w:bCs/>
+                <w:rFonts w:ascii="Arial Narrow" w:hAnsi="Arial Narrow"/>
+                <w:b/>
+                <w:bCs/>
+                <w:sz w:val="26"/>
+                <w:szCs w:val="26"/>
+              </w:rPr>
+            </w:pPr>
+            <w:r>
+              <w:rPr>
+                <w:rFonts w:ascii="Arial Narrow" w:hAnsi="Arial Narrow"/>
+                <w:b/>
+                <w:bCs/>
+                <w:sz w:val="26"/>
+                <w:szCs w:val="26"/>
               </w:rPr>
               <w:t>{{PERIOD_MONTH_2}}</w:t>
             </w:r>
@@ -1408,14 +1719,20 @@
           <w:p>
             <w:pPr>
               <w:rPr>
-                <w:b/>
-                <w:bCs/>
-              </w:rPr>
-            </w:pPr>
-            <w:r>
-              <w:rPr>
-                <w:b/>
-                <w:bCs/>
+                <w:rFonts w:ascii="Arial Narrow" w:hAnsi="Arial Narrow"/>
+                <w:b/>
+                <w:bCs/>
+                <w:sz w:val="26"/>
+                <w:szCs w:val="26"/>
+              </w:rPr>
+            </w:pPr>
+            <w:r>
+              <w:rPr>
+                <w:rFonts w:ascii="Arial Narrow" w:hAnsi="Arial Narrow"/>
+                <w:b/>
+                <w:bCs/>
+                <w:sz w:val="26"/>
+                <w:szCs w:val="26"/>
               </w:rPr>
               <w:t>{{PERIOD_MONTH_3}}</w:t>
             </w:r>
@@ -1438,14 +1755,20 @@
           <w:p>
             <w:pPr>
               <w:rPr>
-                <w:b/>
-                <w:bCs/>
-              </w:rPr>
-            </w:pPr>
-            <w:r>
-              <w:rPr>
-                <w:b/>
-                <w:bCs/>
+                <w:rFonts w:ascii="Arial Narrow" w:hAnsi="Arial Narrow"/>
+                <w:b/>
+                <w:bCs/>
+                <w:sz w:val="26"/>
+                <w:szCs w:val="26"/>
+              </w:rPr>
+            </w:pPr>
+            <w:r>
+              <w:rPr>
+                <w:rFonts w:ascii="Arial Narrow" w:hAnsi="Arial Narrow"/>
+                <w:b/>
+                <w:bCs/>
+                <w:sz w:val="26"/>
+                <w:szCs w:val="26"/>
               </w:rPr>
               <w:t>%ACHIEVED</w:t>
             </w:r>
@@ -1468,14 +1791,20 @@
           <w:p>
             <w:pPr>
               <w:rPr>
-                <w:b/>
-                <w:bCs/>
-              </w:rPr>
-            </w:pPr>
-            <w:r>
-              <w:rPr>
-                <w:b/>
-                <w:bCs/>
+                <w:rFonts w:ascii="Arial Narrow" w:hAnsi="Arial Narrow"/>
+                <w:b/>
+                <w:bCs/>
+                <w:sz w:val="26"/>
+                <w:szCs w:val="26"/>
+              </w:rPr>
+            </w:pPr>
+            <w:r>
+              <w:rPr>
+                <w:rFonts w:ascii="Arial Narrow" w:hAnsi="Arial Narrow"/>
+                <w:b/>
+                <w:bCs/>
+                <w:sz w:val="26"/>
+                <w:szCs w:val="26"/>
               </w:rPr>
               <w:t>YTD VARIANCE</w:t>
             </w:r>
@@ -1503,14 +1832,20 @@
           <w:p>
             <w:pPr>
               <w:rPr>
-                <w:b/>
-                <w:bCs/>
-              </w:rPr>
-            </w:pPr>
-            <w:r>
-              <w:rPr>
-                <w:b/>
-                <w:bCs/>
+                <w:rFonts w:ascii="Arial Narrow" w:hAnsi="Arial Narrow"/>
+                <w:b/>
+                <w:bCs/>
+                <w:sz w:val="26"/>
+                <w:szCs w:val="26"/>
+              </w:rPr>
+            </w:pPr>
+            <w:r>
+              <w:rPr>
+                <w:rFonts w:ascii="Arial Narrow" w:hAnsi="Arial Narrow"/>
+                <w:b/>
+                <w:bCs/>
+                <w:sz w:val="26"/>
+                <w:szCs w:val="26"/>
               </w:rPr>
               <w:t>{{FD_value1}}</w:t>
             </w:r>
@@ -1533,14 +1868,20 @@
           <w:p>
             <w:pPr>
               <w:rPr>
-                <w:b/>
-                <w:bCs/>
-              </w:rPr>
-            </w:pPr>
-            <w:r>
-              <w:rPr>
-                <w:b/>
-                <w:bCs/>
+                <w:rFonts w:ascii="Arial Narrow" w:hAnsi="Arial Narrow"/>
+                <w:b/>
+                <w:bCs/>
+                <w:sz w:val="26"/>
+                <w:szCs w:val="26"/>
+              </w:rPr>
+            </w:pPr>
+            <w:r>
+              <w:rPr>
+                <w:rFonts w:ascii="Arial Narrow" w:hAnsi="Arial Narrow"/>
+                <w:b/>
+                <w:bCs/>
+                <w:sz w:val="26"/>
+                <w:szCs w:val="26"/>
               </w:rPr>
               <w:t>{{r FD_value2_r}}</w:t>
             </w:r>
@@ -1563,14 +1904,20 @@
           <w:p>
             <w:pPr>
               <w:rPr>
-                <w:b/>
-                <w:bCs/>
-              </w:rPr>
-            </w:pPr>
-            <w:r>
-              <w:rPr>
-                <w:b/>
-                <w:bCs/>
+                <w:rFonts w:ascii="Arial Narrow" w:hAnsi="Arial Narrow"/>
+                <w:b/>
+                <w:bCs/>
+                <w:sz w:val="26"/>
+                <w:szCs w:val="26"/>
+              </w:rPr>
+            </w:pPr>
+            <w:r>
+              <w:rPr>
+                <w:rFonts w:ascii="Arial Narrow" w:hAnsi="Arial Narrow"/>
+                <w:b/>
+                <w:bCs/>
+                <w:sz w:val="26"/>
+                <w:szCs w:val="26"/>
               </w:rPr>
               <w:t>{{r FD_value3_r}}</w:t>
             </w:r>
@@ -1591,11 +1938,28 @@
             </w:tcMar>
           </w:tcPr>
           <w:p>
-            <w:r>
+            <w:pPr>
+              <w:rPr>
+                <w:rFonts w:ascii="Arial Narrow" w:hAnsi="Arial Narrow"/>
+                <w:sz w:val="26"/>
+                <w:szCs w:val="26"/>
+              </w:rPr>
+            </w:pPr>
+            <w:r>
+              <w:rPr>
+                <w:rFonts w:ascii="Arial Narrow" w:hAnsi="Arial Narrow"/>
+                <w:sz w:val="26"/>
+                <w:szCs w:val="26"/>
+              </w:rPr>
               <w:t>{{FD_value4</w:t>
             </w:r>
             <w:proofErr w:type="gramStart"/>
             <w:r>
+              <w:rPr>
+                <w:rFonts w:ascii="Arial Narrow" w:hAnsi="Arial Narrow"/>
+                <w:sz w:val="26"/>
+                <w:szCs w:val="26"/>
+              </w:rPr>
               <w:t>}}%</w:t>
             </w:r>
             <w:proofErr w:type="gramEnd"/>
@@ -1616,7 +1980,19 @@
             </w:tcMar>
           </w:tcPr>
           <w:p>
-            <w:r>
+            <w:pPr>
+              <w:rPr>
+                <w:rFonts w:ascii="Arial Narrow" w:hAnsi="Arial Narrow"/>
+                <w:sz w:val="26"/>
+                <w:szCs w:val="26"/>
+              </w:rPr>
+            </w:pPr>
+            <w:r>
+              <w:rPr>
+                <w:rFonts w:ascii="Arial Narrow" w:hAnsi="Arial Narrow"/>
+                <w:sz w:val="26"/>
+                <w:szCs w:val="26"/>
+              </w:rPr>
               <w:t>{{r FD_value5_r}}</w:t>
             </w:r>
           </w:p>
@@ -1639,6 +2015,11 @@
         </w:rPr>
       </w:pPr>
       <w:r>
+        <w:rPr>
+          <w:rFonts w:ascii="Arial Narrow" w:hAnsi="Arial Narrow"/>
+          <w:sz w:val="26"/>
+          <w:szCs w:val="26"/>
+        </w:rPr>
         <w:t>{{FD_summary_1}}</w:t>
       </w:r>
     </w:p>
@@ -1658,6 +2039,11 @@
         </w:rPr>
       </w:pPr>
       <w:r>
+        <w:rPr>
+          <w:rFonts w:ascii="Arial Narrow" w:hAnsi="Arial Narrow"/>
+          <w:sz w:val="26"/>
+          <w:szCs w:val="26"/>
+        </w:rPr>
         <w:t>{{FD_summary_2}}</w:t>
       </w:r>
     </w:p>
@@ -1733,15 +2119,22 @@
           <w:p>
             <w:pPr>
               <w:rPr>
-                <w:b/>
-                <w:bCs/>
-              </w:rPr>
-            </w:pPr>
-            <w:r>
-              <w:rPr>
-                <w:b/>
-                <w:bCs/>
-              </w:rPr>
+                <w:rFonts w:ascii="Arial Narrow" w:hAnsi="Arial Narrow"/>
+                <w:b/>
+                <w:bCs/>
+                <w:sz w:val="26"/>
+                <w:szCs w:val="26"/>
+              </w:rPr>
+            </w:pPr>
+            <w:r>
+              <w:rPr>
+                <w:rFonts w:ascii="Arial Narrow" w:hAnsi="Arial Narrow"/>
+                <w:b/>
+                <w:bCs/>
+                <w:sz w:val="26"/>
+                <w:szCs w:val="26"/>
+              </w:rPr>
+              <w:lastRenderedPageBreak/>
               <w:t>{{PERIOD_MONTH_1}}</w:t>
             </w:r>
           </w:p>
@@ -1764,14 +2157,20 @@
           <w:p>
             <w:pPr>
               <w:rPr>
-                <w:b/>
-                <w:bCs/>
-              </w:rPr>
-            </w:pPr>
-            <w:r>
-              <w:rPr>
-                <w:b/>
-                <w:bCs/>
+                <w:rFonts w:ascii="Arial Narrow" w:hAnsi="Arial Narrow"/>
+                <w:b/>
+                <w:bCs/>
+                <w:sz w:val="26"/>
+                <w:szCs w:val="26"/>
+              </w:rPr>
+            </w:pPr>
+            <w:r>
+              <w:rPr>
+                <w:rFonts w:ascii="Arial Narrow" w:hAnsi="Arial Narrow"/>
+                <w:b/>
+                <w:bCs/>
+                <w:sz w:val="26"/>
+                <w:szCs w:val="26"/>
               </w:rPr>
               <w:t>{{PERIOD_MONTH_2}}</w:t>
             </w:r>
@@ -1795,14 +2194,20 @@
           <w:p>
             <w:pPr>
               <w:rPr>
-                <w:b/>
-                <w:bCs/>
-              </w:rPr>
-            </w:pPr>
-            <w:r>
-              <w:rPr>
-                <w:b/>
-                <w:bCs/>
+                <w:rFonts w:ascii="Arial Narrow" w:hAnsi="Arial Narrow"/>
+                <w:b/>
+                <w:bCs/>
+                <w:sz w:val="26"/>
+                <w:szCs w:val="26"/>
+              </w:rPr>
+            </w:pPr>
+            <w:r>
+              <w:rPr>
+                <w:rFonts w:ascii="Arial Narrow" w:hAnsi="Arial Narrow"/>
+                <w:b/>
+                <w:bCs/>
+                <w:sz w:val="26"/>
+                <w:szCs w:val="26"/>
               </w:rPr>
               <w:t>{{PERIOD_MONTH_3}}</w:t>
             </w:r>
@@ -1825,14 +2230,20 @@
           <w:p>
             <w:pPr>
               <w:rPr>
-                <w:b/>
-                <w:bCs/>
-              </w:rPr>
-            </w:pPr>
-            <w:r>
-              <w:rPr>
-                <w:b/>
-                <w:bCs/>
+                <w:rFonts w:ascii="Arial Narrow" w:hAnsi="Arial Narrow"/>
+                <w:b/>
+                <w:bCs/>
+                <w:sz w:val="26"/>
+                <w:szCs w:val="26"/>
+              </w:rPr>
+            </w:pPr>
+            <w:r>
+              <w:rPr>
+                <w:rFonts w:ascii="Arial Narrow" w:hAnsi="Arial Narrow"/>
+                <w:b/>
+                <w:bCs/>
+                <w:sz w:val="26"/>
+                <w:szCs w:val="26"/>
               </w:rPr>
               <w:t>%ACHIEVED</w:t>
             </w:r>
@@ -1855,14 +2266,20 @@
           <w:p>
             <w:pPr>
               <w:rPr>
-                <w:b/>
-                <w:bCs/>
-              </w:rPr>
-            </w:pPr>
-            <w:r>
-              <w:rPr>
-                <w:b/>
-                <w:bCs/>
+                <w:rFonts w:ascii="Arial Narrow" w:hAnsi="Arial Narrow"/>
+                <w:b/>
+                <w:bCs/>
+                <w:sz w:val="26"/>
+                <w:szCs w:val="26"/>
+              </w:rPr>
+            </w:pPr>
+            <w:r>
+              <w:rPr>
+                <w:rFonts w:ascii="Arial Narrow" w:hAnsi="Arial Narrow"/>
+                <w:b/>
+                <w:bCs/>
+                <w:sz w:val="26"/>
+                <w:szCs w:val="26"/>
               </w:rPr>
               <w:t>YTD VARIANCE</w:t>
             </w:r>
@@ -1890,16 +2307,21 @@
           <w:p>
             <w:pPr>
               <w:rPr>
-                <w:b/>
-                <w:bCs/>
-              </w:rPr>
-            </w:pPr>
-            <w:r>
-              <w:rPr>
-                <w:b/>
-                <w:bCs/>
-              </w:rPr>
-              <w:lastRenderedPageBreak/>
+                <w:rFonts w:ascii="Arial Narrow" w:hAnsi="Arial Narrow"/>
+                <w:b/>
+                <w:bCs/>
+                <w:sz w:val="26"/>
+                <w:szCs w:val="26"/>
+              </w:rPr>
+            </w:pPr>
+            <w:r>
+              <w:rPr>
+                <w:rFonts w:ascii="Arial Narrow" w:hAnsi="Arial Narrow"/>
+                <w:b/>
+                <w:bCs/>
+                <w:sz w:val="26"/>
+                <w:szCs w:val="26"/>
+              </w:rPr>
               <w:t>{{DP_value1}}</w:t>
             </w:r>
           </w:p>
@@ -1921,14 +2343,20 @@
           <w:p>
             <w:pPr>
               <w:rPr>
-                <w:b/>
-                <w:bCs/>
-              </w:rPr>
-            </w:pPr>
-            <w:r>
-              <w:rPr>
-                <w:b/>
-                <w:bCs/>
+                <w:rFonts w:ascii="Arial Narrow" w:hAnsi="Arial Narrow"/>
+                <w:b/>
+                <w:bCs/>
+                <w:sz w:val="26"/>
+                <w:szCs w:val="26"/>
+              </w:rPr>
+            </w:pPr>
+            <w:r>
+              <w:rPr>
+                <w:rFonts w:ascii="Arial Narrow" w:hAnsi="Arial Narrow"/>
+                <w:b/>
+                <w:bCs/>
+                <w:sz w:val="26"/>
+                <w:szCs w:val="26"/>
               </w:rPr>
               <w:t>{{r DP_value2_r}}</w:t>
             </w:r>
@@ -1951,14 +2379,20 @@
           <w:p>
             <w:pPr>
               <w:rPr>
-                <w:b/>
-                <w:bCs/>
-              </w:rPr>
-            </w:pPr>
-            <w:r>
-              <w:rPr>
-                <w:b/>
-                <w:bCs/>
+                <w:rFonts w:ascii="Arial Narrow" w:hAnsi="Arial Narrow"/>
+                <w:b/>
+                <w:bCs/>
+                <w:sz w:val="26"/>
+                <w:szCs w:val="26"/>
+              </w:rPr>
+            </w:pPr>
+            <w:r>
+              <w:rPr>
+                <w:rFonts w:ascii="Arial Narrow" w:hAnsi="Arial Narrow"/>
+                <w:b/>
+                <w:bCs/>
+                <w:sz w:val="26"/>
+                <w:szCs w:val="26"/>
               </w:rPr>
               <w:t>{{r DP_value3_r}}</w:t>
             </w:r>
@@ -1979,11 +2413,28 @@
             </w:tcMar>
           </w:tcPr>
           <w:p>
-            <w:r>
+            <w:pPr>
+              <w:rPr>
+                <w:rFonts w:ascii="Arial Narrow" w:hAnsi="Arial Narrow"/>
+                <w:sz w:val="26"/>
+                <w:szCs w:val="26"/>
+              </w:rPr>
+            </w:pPr>
+            <w:r>
+              <w:rPr>
+                <w:rFonts w:ascii="Arial Narrow" w:hAnsi="Arial Narrow"/>
+                <w:sz w:val="26"/>
+                <w:szCs w:val="26"/>
+              </w:rPr>
               <w:t>{{DP_value4</w:t>
             </w:r>
             <w:proofErr w:type="gramStart"/>
             <w:r>
+              <w:rPr>
+                <w:rFonts w:ascii="Arial Narrow" w:hAnsi="Arial Narrow"/>
+                <w:sz w:val="26"/>
+                <w:szCs w:val="26"/>
+              </w:rPr>
               <w:t>}}%</w:t>
             </w:r>
             <w:proofErr w:type="gramEnd"/>
@@ -2004,7 +2455,19 @@
             </w:tcMar>
           </w:tcPr>
           <w:p>
-            <w:r>
+            <w:pPr>
+              <w:rPr>
+                <w:rFonts w:ascii="Arial Narrow" w:hAnsi="Arial Narrow"/>
+                <w:sz w:val="26"/>
+                <w:szCs w:val="26"/>
+              </w:rPr>
+            </w:pPr>
+            <w:r>
+              <w:rPr>
+                <w:rFonts w:ascii="Arial Narrow" w:hAnsi="Arial Narrow"/>
+                <w:sz w:val="26"/>
+                <w:szCs w:val="26"/>
+              </w:rPr>
               <w:t>{{r DP_value5_r}}</w:t>
             </w:r>
           </w:p>
@@ -2027,6 +2490,11 @@
         </w:rPr>
       </w:pPr>
       <w:r>
+        <w:rPr>
+          <w:rFonts w:ascii="Arial Narrow" w:hAnsi="Arial Narrow"/>
+          <w:sz w:val="26"/>
+          <w:szCs w:val="26"/>
+        </w:rPr>
         <w:t>{{DP_summary_1}}</w:t>
       </w:r>
     </w:p>
@@ -2046,6 +2514,11 @@
         </w:rPr>
       </w:pPr>
       <w:r>
+        <w:rPr>
+          <w:rFonts w:ascii="Arial Narrow" w:hAnsi="Arial Narrow"/>
+          <w:sz w:val="26"/>
+          <w:szCs w:val="26"/>
+        </w:rPr>
         <w:t>{{DP_summary_2}}</w:t>
       </w:r>
     </w:p>
@@ -2121,14 +2594,20 @@
           <w:p>
             <w:pPr>
               <w:rPr>
-                <w:b/>
-                <w:bCs/>
-              </w:rPr>
-            </w:pPr>
-            <w:r>
-              <w:rPr>
-                <w:b/>
-                <w:bCs/>
+                <w:rFonts w:ascii="Arial Narrow" w:hAnsi="Arial Narrow"/>
+                <w:b/>
+                <w:bCs/>
+                <w:sz w:val="26"/>
+                <w:szCs w:val="26"/>
+              </w:rPr>
+            </w:pPr>
+            <w:r>
+              <w:rPr>
+                <w:rFonts w:ascii="Arial Narrow" w:hAnsi="Arial Narrow"/>
+                <w:b/>
+                <w:bCs/>
+                <w:sz w:val="26"/>
+                <w:szCs w:val="26"/>
               </w:rPr>
               <w:t>{{PERIOD_MONTH_1}}</w:t>
             </w:r>
@@ -2152,14 +2631,20 @@
           <w:p>
             <w:pPr>
               <w:rPr>
-                <w:b/>
-                <w:bCs/>
-              </w:rPr>
-            </w:pPr>
-            <w:r>
-              <w:rPr>
-                <w:b/>
-                <w:bCs/>
+                <w:rFonts w:ascii="Arial Narrow" w:hAnsi="Arial Narrow"/>
+                <w:b/>
+                <w:bCs/>
+                <w:sz w:val="26"/>
+                <w:szCs w:val="26"/>
+              </w:rPr>
+            </w:pPr>
+            <w:r>
+              <w:rPr>
+                <w:rFonts w:ascii="Arial Narrow" w:hAnsi="Arial Narrow"/>
+                <w:b/>
+                <w:bCs/>
+                <w:sz w:val="26"/>
+                <w:szCs w:val="26"/>
               </w:rPr>
               <w:t>{{PERIOD_MONTH_2}}</w:t>
             </w:r>
@@ -2183,14 +2668,20 @@
           <w:p>
             <w:pPr>
               <w:rPr>
-                <w:b/>
-                <w:bCs/>
-              </w:rPr>
-            </w:pPr>
-            <w:r>
-              <w:rPr>
-                <w:b/>
-                <w:bCs/>
+                <w:rFonts w:ascii="Arial Narrow" w:hAnsi="Arial Narrow"/>
+                <w:b/>
+                <w:bCs/>
+                <w:sz w:val="26"/>
+                <w:szCs w:val="26"/>
+              </w:rPr>
+            </w:pPr>
+            <w:r>
+              <w:rPr>
+                <w:rFonts w:ascii="Arial Narrow" w:hAnsi="Arial Narrow"/>
+                <w:b/>
+                <w:bCs/>
+                <w:sz w:val="26"/>
+                <w:szCs w:val="26"/>
               </w:rPr>
               <w:t>{{PERIOD_MONTH_3}}</w:t>
             </w:r>
@@ -2213,14 +2704,20 @@
           <w:p>
             <w:pPr>
               <w:rPr>
-                <w:b/>
-                <w:bCs/>
-              </w:rPr>
-            </w:pPr>
-            <w:r>
-              <w:rPr>
-                <w:b/>
-                <w:bCs/>
+                <w:rFonts w:ascii="Arial Narrow" w:hAnsi="Arial Narrow"/>
+                <w:b/>
+                <w:bCs/>
+                <w:sz w:val="26"/>
+                <w:szCs w:val="26"/>
+              </w:rPr>
+            </w:pPr>
+            <w:r>
+              <w:rPr>
+                <w:rFonts w:ascii="Arial Narrow" w:hAnsi="Arial Narrow"/>
+                <w:b/>
+                <w:bCs/>
+                <w:sz w:val="26"/>
+                <w:szCs w:val="26"/>
               </w:rPr>
               <w:t>LOAN TO DEPOSIT</w:t>
             </w:r>
@@ -2243,14 +2740,20 @@
           <w:p>
             <w:pPr>
               <w:rPr>
-                <w:b/>
-                <w:bCs/>
-              </w:rPr>
-            </w:pPr>
-            <w:r>
-              <w:rPr>
-                <w:b/>
-                <w:bCs/>
+                <w:rFonts w:ascii="Arial Narrow" w:hAnsi="Arial Narrow"/>
+                <w:b/>
+                <w:bCs/>
+                <w:sz w:val="26"/>
+                <w:szCs w:val="26"/>
+              </w:rPr>
+            </w:pPr>
+            <w:r>
+              <w:rPr>
+                <w:rFonts w:ascii="Arial Narrow" w:hAnsi="Arial Narrow"/>
+                <w:b/>
+                <w:bCs/>
+                <w:sz w:val="26"/>
+                <w:szCs w:val="26"/>
               </w:rPr>
               <w:t>YTD VARIANCE</w:t>
             </w:r>
@@ -2278,14 +2781,20 @@
           <w:p>
             <w:pPr>
               <w:rPr>
-                <w:b/>
-                <w:bCs/>
-              </w:rPr>
-            </w:pPr>
-            <w:r>
-              <w:rPr>
-                <w:b/>
-                <w:bCs/>
+                <w:rFonts w:ascii="Arial Narrow" w:hAnsi="Arial Narrow"/>
+                <w:b/>
+                <w:bCs/>
+                <w:sz w:val="26"/>
+                <w:szCs w:val="26"/>
+              </w:rPr>
+            </w:pPr>
+            <w:r>
+              <w:rPr>
+                <w:rFonts w:ascii="Arial Narrow" w:hAnsi="Arial Narrow"/>
+                <w:b/>
+                <w:bCs/>
+                <w:sz w:val="26"/>
+                <w:szCs w:val="26"/>
               </w:rPr>
               <w:t>{{TRA_value1}}</w:t>
             </w:r>
@@ -2308,14 +2817,20 @@
           <w:p>
             <w:pPr>
               <w:rPr>
-                <w:b/>
-                <w:bCs/>
-              </w:rPr>
-            </w:pPr>
-            <w:r>
-              <w:rPr>
-                <w:b/>
-                <w:bCs/>
+                <w:rFonts w:ascii="Arial Narrow" w:hAnsi="Arial Narrow"/>
+                <w:b/>
+                <w:bCs/>
+                <w:sz w:val="26"/>
+                <w:szCs w:val="26"/>
+              </w:rPr>
+            </w:pPr>
+            <w:r>
+              <w:rPr>
+                <w:rFonts w:ascii="Arial Narrow" w:hAnsi="Arial Narrow"/>
+                <w:b/>
+                <w:bCs/>
+                <w:sz w:val="26"/>
+                <w:szCs w:val="26"/>
               </w:rPr>
               <w:t>{{r TRA_value2_r}}</w:t>
             </w:r>
@@ -2338,14 +2853,20 @@
           <w:p>
             <w:pPr>
               <w:rPr>
-                <w:b/>
-                <w:bCs/>
-              </w:rPr>
-            </w:pPr>
-            <w:r>
-              <w:rPr>
-                <w:b/>
-                <w:bCs/>
+                <w:rFonts w:ascii="Arial Narrow" w:hAnsi="Arial Narrow"/>
+                <w:b/>
+                <w:bCs/>
+                <w:sz w:val="26"/>
+                <w:szCs w:val="26"/>
+              </w:rPr>
+            </w:pPr>
+            <w:r>
+              <w:rPr>
+                <w:rFonts w:ascii="Arial Narrow" w:hAnsi="Arial Narrow"/>
+                <w:b/>
+                <w:bCs/>
+                <w:sz w:val="26"/>
+                <w:szCs w:val="26"/>
               </w:rPr>
               <w:t>{{r TRA_value3_r}}</w:t>
             </w:r>
@@ -2366,11 +2887,28 @@
             </w:tcMar>
           </w:tcPr>
           <w:p>
-            <w:r>
+            <w:pPr>
+              <w:rPr>
+                <w:rFonts w:ascii="Arial Narrow" w:hAnsi="Arial Narrow"/>
+                <w:sz w:val="26"/>
+                <w:szCs w:val="26"/>
+              </w:rPr>
+            </w:pPr>
+            <w:r>
+              <w:rPr>
+                <w:rFonts w:ascii="Arial Narrow" w:hAnsi="Arial Narrow"/>
+                <w:sz w:val="26"/>
+                <w:szCs w:val="26"/>
+              </w:rPr>
               <w:t>{{TRA_value4</w:t>
             </w:r>
             <w:proofErr w:type="gramStart"/>
             <w:r>
+              <w:rPr>
+                <w:rFonts w:ascii="Arial Narrow" w:hAnsi="Arial Narrow"/>
+                <w:sz w:val="26"/>
+                <w:szCs w:val="26"/>
+              </w:rPr>
               <w:t>}}%</w:t>
             </w:r>
             <w:proofErr w:type="gramEnd"/>
@@ -2391,7 +2929,19 @@
             </w:tcMar>
           </w:tcPr>
           <w:p>
-            <w:r>
+            <w:pPr>
+              <w:rPr>
+                <w:rFonts w:ascii="Arial Narrow" w:hAnsi="Arial Narrow"/>
+                <w:sz w:val="26"/>
+                <w:szCs w:val="26"/>
+              </w:rPr>
+            </w:pPr>
+            <w:r>
+              <w:rPr>
+                <w:rFonts w:ascii="Arial Narrow" w:hAnsi="Arial Narrow"/>
+                <w:sz w:val="26"/>
+                <w:szCs w:val="26"/>
+              </w:rPr>
               <w:t>{{r TRA_value5_r}}</w:t>
             </w:r>
           </w:p>
@@ -2414,6 +2964,11 @@
         </w:rPr>
       </w:pPr>
       <w:r>
+        <w:rPr>
+          <w:rFonts w:ascii="Arial Narrow" w:hAnsi="Arial Narrow"/>
+          <w:sz w:val="26"/>
+          <w:szCs w:val="26"/>
+        </w:rPr>
         <w:t>{{TRA_summary_1}}</w:t>
       </w:r>
     </w:p>
@@ -2433,6 +2988,11 @@
         </w:rPr>
       </w:pPr>
       <w:r>
+        <w:rPr>
+          <w:rFonts w:ascii="Arial Narrow" w:hAnsi="Arial Narrow"/>
+          <w:sz w:val="26"/>
+          <w:szCs w:val="26"/>
+        </w:rPr>
         <w:t>{{TRA_summary_2}}</w:t>
       </w:r>
     </w:p>
@@ -2452,6 +3012,11 @@
         </w:rPr>
       </w:pPr>
       <w:r>
+        <w:rPr>
+          <w:rFonts w:ascii="Arial Narrow" w:hAnsi="Arial Narrow"/>
+          <w:sz w:val="26"/>
+          <w:szCs w:val="26"/>
+        </w:rPr>
         <w:t>{{TRA_summary_3}}</w:t>
       </w:r>
     </w:p>
@@ -2523,7 +3088,19 @@
             </w:tcMar>
           </w:tcPr>
           <w:p>
-            <w:r>
+            <w:pPr>
+              <w:rPr>
+                <w:rFonts w:ascii="Arial Narrow" w:hAnsi="Arial Narrow"/>
+                <w:sz w:val="26"/>
+                <w:szCs w:val="26"/>
+              </w:rPr>
+            </w:pPr>
+            <w:r>
+              <w:rPr>
+                <w:rFonts w:ascii="Arial Narrow" w:hAnsi="Arial Narrow"/>
+                <w:sz w:val="26"/>
+                <w:szCs w:val="26"/>
+              </w:rPr>
               <w:t xml:space="preserve">VALUE </w:t>
             </w:r>
           </w:p>
@@ -2543,7 +3120,19 @@
             </w:tcMar>
           </w:tcPr>
           <w:p>
-            <w:r>
+            <w:pPr>
+              <w:rPr>
+                <w:rFonts w:ascii="Arial Narrow" w:hAnsi="Arial Narrow"/>
+                <w:sz w:val="26"/>
+                <w:szCs w:val="26"/>
+              </w:rPr>
+            </w:pPr>
+            <w:r>
+              <w:rPr>
+                <w:rFonts w:ascii="Arial Narrow" w:hAnsi="Arial Narrow"/>
+                <w:sz w:val="26"/>
+                <w:szCs w:val="26"/>
+              </w:rPr>
               <w:t xml:space="preserve"> </w:t>
             </w:r>
           </w:p>
@@ -2568,7 +3157,19 @@
             </w:tcMar>
           </w:tcPr>
           <w:p>
-            <w:r>
+            <w:pPr>
+              <w:rPr>
+                <w:rFonts w:ascii="Arial Narrow" w:hAnsi="Arial Narrow"/>
+                <w:sz w:val="26"/>
+                <w:szCs w:val="26"/>
+              </w:rPr>
+            </w:pPr>
+            <w:r>
+              <w:rPr>
+                <w:rFonts w:ascii="Arial Narrow" w:hAnsi="Arial Narrow"/>
+                <w:sz w:val="26"/>
+                <w:szCs w:val="26"/>
+              </w:rPr>
               <w:t>{{period_month_2}}</w:t>
             </w:r>
           </w:p>
@@ -2588,7 +3189,19 @@
             </w:tcMar>
           </w:tcPr>
           <w:p>
-            <w:r>
+            <w:pPr>
+              <w:rPr>
+                <w:rFonts w:ascii="Arial Narrow" w:hAnsi="Arial Narrow"/>
+                <w:sz w:val="26"/>
+                <w:szCs w:val="26"/>
+              </w:rPr>
+            </w:pPr>
+            <w:r>
+              <w:rPr>
+                <w:rFonts w:ascii="Arial Narrow" w:hAnsi="Arial Narrow"/>
+                <w:sz w:val="26"/>
+                <w:szCs w:val="26"/>
+              </w:rPr>
               <w:t>{{period_month_3}}</w:t>
             </w:r>
           </w:p>
@@ -2608,7 +3221,19 @@
             </w:tcMar>
           </w:tcPr>
           <w:p>
-            <w:r>
+            <w:pPr>
+              <w:rPr>
+                <w:rFonts w:ascii="Arial Narrow" w:hAnsi="Arial Narrow"/>
+                <w:sz w:val="26"/>
+                <w:szCs w:val="26"/>
+              </w:rPr>
+            </w:pPr>
+            <w:r>
+              <w:rPr>
+                <w:rFonts w:ascii="Arial Narrow" w:hAnsi="Arial Narrow"/>
+                <w:sz w:val="26"/>
+                <w:szCs w:val="26"/>
+              </w:rPr>
               <w:t>VARIANCE</w:t>
             </w:r>
           </w:p>
@@ -2633,7 +3258,19 @@
             </w:tcMar>
           </w:tcPr>
           <w:p>
-            <w:r>
+            <w:pPr>
+              <w:rPr>
+                <w:rFonts w:ascii="Arial Narrow" w:hAnsi="Arial Narrow"/>
+                <w:sz w:val="26"/>
+                <w:szCs w:val="26"/>
+              </w:rPr>
+            </w:pPr>
+            <w:r>
+              <w:rPr>
+                <w:rFonts w:ascii="Arial Narrow" w:hAnsi="Arial Narrow"/>
+                <w:sz w:val="26"/>
+                <w:szCs w:val="26"/>
+              </w:rPr>
               <w:t>{{AB_value1}}</w:t>
             </w:r>
           </w:p>
@@ -2653,7 +3290,19 @@
             </w:tcMar>
           </w:tcPr>
           <w:p>
-            <w:r>
+            <w:pPr>
+              <w:rPr>
+                <w:rFonts w:ascii="Arial Narrow" w:hAnsi="Arial Narrow"/>
+                <w:sz w:val="26"/>
+                <w:szCs w:val="26"/>
+              </w:rPr>
+            </w:pPr>
+            <w:r>
+              <w:rPr>
+                <w:rFonts w:ascii="Arial Narrow" w:hAnsi="Arial Narrow"/>
+                <w:sz w:val="26"/>
+                <w:szCs w:val="26"/>
+              </w:rPr>
               <w:t>{{r AB_value2_r}}</w:t>
             </w:r>
           </w:p>
@@ -2674,7 +3323,19 @@
             <w:vAlign w:val="bottom"/>
           </w:tcPr>
           <w:p>
-            <w:r>
+            <w:pPr>
+              <w:rPr>
+                <w:rFonts w:ascii="Arial Narrow" w:hAnsi="Arial Narrow"/>
+                <w:sz w:val="26"/>
+                <w:szCs w:val="26"/>
+              </w:rPr>
+            </w:pPr>
+            <w:r>
+              <w:rPr>
+                <w:rFonts w:ascii="Arial Narrow" w:hAnsi="Arial Narrow"/>
+                <w:sz w:val="26"/>
+                <w:szCs w:val="26"/>
+              </w:rPr>
               <w:t>{{r AB_value3_r}}</w:t>
             </w:r>
           </w:p>
@@ -2697,6 +3358,11 @@
         </w:rPr>
       </w:pPr>
       <w:r>
+        <w:rPr>
+          <w:rFonts w:ascii="Arial Narrow" w:hAnsi="Arial Narrow"/>
+          <w:sz w:val="26"/>
+          <w:szCs w:val="26"/>
+        </w:rPr>
         <w:t>{{AB_summary_1}}</w:t>
       </w:r>
     </w:p>
@@ -2725,12 +3391,20 @@
       </w:pPr>
       <w:r>
         <w:rPr>
+          <w:rFonts w:ascii="Arial Narrow" w:hAnsi="Arial Narrow"/>
           <w:b/>
           <w:bCs/>
+          <w:sz w:val="26"/>
+          <w:szCs w:val="26"/>
         </w:rPr>
         <w:t>ACCOUNTS OPENED</w:t>
       </w:r>
       <w:r>
+        <w:rPr>
+          <w:rFonts w:ascii="Arial Narrow" w:hAnsi="Arial Narrow"/>
+          <w:sz w:val="26"/>
+          <w:szCs w:val="26"/>
+        </w:rPr>
         <w:t>: {{AO_summary}}</w:t>
       </w:r>
     </w:p>
@@ -2747,12 +3421,20 @@
       </w:pPr>
       <w:r>
         <w:rPr>
+          <w:rFonts w:ascii="Arial Narrow" w:hAnsi="Arial Narrow"/>
           <w:b/>
           <w:bCs/>
+          <w:sz w:val="26"/>
+          <w:szCs w:val="26"/>
         </w:rPr>
         <w:t>CARDS</w:t>
       </w:r>
       <w:r>
+        <w:rPr>
+          <w:rFonts w:ascii="Arial Narrow" w:hAnsi="Arial Narrow"/>
+          <w:sz w:val="26"/>
+          <w:szCs w:val="26"/>
+        </w:rPr>
         <w:t>: {{CDS_summary}}</w:t>
       </w:r>
     </w:p>
@@ -2769,12 +3451,20 @@
       </w:pPr>
       <w:r>
         <w:rPr>
+          <w:rFonts w:ascii="Arial Narrow" w:hAnsi="Arial Narrow"/>
           <w:b/>
           <w:bCs/>
+          <w:sz w:val="26"/>
+          <w:szCs w:val="26"/>
         </w:rPr>
         <w:t>CHANNELS ENROLLED</w:t>
       </w:r>
       <w:r>
+        <w:rPr>
+          <w:rFonts w:ascii="Arial Narrow" w:hAnsi="Arial Narrow"/>
+          <w:sz w:val="26"/>
+          <w:szCs w:val="26"/>
+        </w:rPr>
         <w:t>: {{CE_summary}}</w:t>
       </w:r>
     </w:p>
@@ -2790,12 +3480,20 @@
       </w:pPr>
       <w:r>
         <w:rPr>
+          <w:rFonts w:ascii="Arial Narrow" w:hAnsi="Arial Narrow"/>
           <w:b/>
           <w:bCs/>
+          <w:sz w:val="26"/>
+          <w:szCs w:val="26"/>
         </w:rPr>
         <w:t>AGENTS ONBOARDED</w:t>
       </w:r>
       <w:r>
+        <w:rPr>
+          <w:rFonts w:ascii="Arial Narrow" w:hAnsi="Arial Narrow"/>
+          <w:sz w:val="26"/>
+          <w:szCs w:val="26"/>
+        </w:rPr>
         <w:t>: {{AOB_summary}}</w:t>
       </w:r>
     </w:p>
@@ -2822,12 +3520,20 @@
       </w:pPr>
       <w:r>
         <w:rPr>
+          <w:rFonts w:ascii="Arial Narrow" w:hAnsi="Arial Narrow"/>
           <w:b/>
           <w:bCs/>
+          <w:sz w:val="26"/>
+          <w:szCs w:val="26"/>
         </w:rPr>
         <w:t>DORMANT ACCOUNT</w:t>
       </w:r>
       <w:r>
+        <w:rPr>
+          <w:rFonts w:ascii="Arial Narrow" w:hAnsi="Arial Narrow"/>
+          <w:sz w:val="26"/>
+          <w:szCs w:val="26"/>
+        </w:rPr>
         <w:t>: {{DMT_ACT_summary}}</w:t>
       </w:r>
     </w:p>
@@ -2843,12 +3549,20 @@
       </w:pPr>
       <w:r>
         <w:rPr>
+          <w:rFonts w:ascii="Arial Narrow" w:hAnsi="Arial Narrow"/>
           <w:b/>
           <w:bCs/>
+          <w:sz w:val="26"/>
+          <w:szCs w:val="26"/>
         </w:rPr>
         <w:t>POS</w:t>
       </w:r>
       <w:r>
+        <w:rPr>
+          <w:rFonts w:ascii="Arial Narrow" w:hAnsi="Arial Narrow"/>
+          <w:sz w:val="26"/>
+          <w:szCs w:val="26"/>
+        </w:rPr>
         <w:t>: {{POS_summary}}</w:t>
       </w:r>
     </w:p>
@@ -2910,14 +3624,20 @@
           <w:p>
             <w:pPr>
               <w:rPr>
-                <w:b/>
-                <w:bCs/>
-              </w:rPr>
-            </w:pPr>
-            <w:r>
-              <w:rPr>
-                <w:b/>
-                <w:bCs/>
+                <w:rFonts w:ascii="Arial Narrow" w:hAnsi="Arial Narrow"/>
+                <w:b/>
+                <w:bCs/>
+                <w:sz w:val="26"/>
+                <w:szCs w:val="26"/>
+              </w:rPr>
+            </w:pPr>
+            <w:r>
+              <w:rPr>
+                <w:rFonts w:ascii="Arial Narrow" w:hAnsi="Arial Narrow"/>
+                <w:b/>
+                <w:bCs/>
+                <w:sz w:val="26"/>
+                <w:szCs w:val="26"/>
               </w:rPr>
               <w:t>{{PERIOD_MONTH_1}}</w:t>
             </w:r>
@@ -2940,14 +3660,20 @@
           <w:p>
             <w:pPr>
               <w:rPr>
-                <w:b/>
-                <w:bCs/>
-              </w:rPr>
-            </w:pPr>
-            <w:r>
-              <w:rPr>
-                <w:b/>
-                <w:bCs/>
+                <w:rFonts w:ascii="Arial Narrow" w:hAnsi="Arial Narrow"/>
+                <w:b/>
+                <w:bCs/>
+                <w:sz w:val="26"/>
+                <w:szCs w:val="26"/>
+              </w:rPr>
+            </w:pPr>
+            <w:r>
+              <w:rPr>
+                <w:rFonts w:ascii="Arial Narrow" w:hAnsi="Arial Narrow"/>
+                <w:b/>
+                <w:bCs/>
+                <w:sz w:val="26"/>
+                <w:szCs w:val="26"/>
               </w:rPr>
               <w:t>{{PERIOD_MONTH_2}}</w:t>
             </w:r>
@@ -2970,14 +3696,20 @@
           <w:p>
             <w:pPr>
               <w:rPr>
-                <w:b/>
-                <w:bCs/>
-              </w:rPr>
-            </w:pPr>
-            <w:r>
-              <w:rPr>
-                <w:b/>
-                <w:bCs/>
+                <w:rFonts w:ascii="Arial Narrow" w:hAnsi="Arial Narrow"/>
+                <w:b/>
+                <w:bCs/>
+                <w:sz w:val="26"/>
+                <w:szCs w:val="26"/>
+              </w:rPr>
+            </w:pPr>
+            <w:r>
+              <w:rPr>
+                <w:rFonts w:ascii="Arial Narrow" w:hAnsi="Arial Narrow"/>
+                <w:b/>
+                <w:bCs/>
+                <w:sz w:val="26"/>
+                <w:szCs w:val="26"/>
               </w:rPr>
               <w:t>{{PERIOD_MONTH_3}}</w:t>
             </w:r>
@@ -3000,14 +3732,20 @@
           <w:p>
             <w:pPr>
               <w:rPr>
-                <w:b/>
-                <w:bCs/>
-              </w:rPr>
-            </w:pPr>
-            <w:r>
-              <w:rPr>
-                <w:b/>
-                <w:bCs/>
+                <w:rFonts w:ascii="Arial Narrow" w:hAnsi="Arial Narrow"/>
+                <w:b/>
+                <w:bCs/>
+                <w:sz w:val="26"/>
+                <w:szCs w:val="26"/>
+              </w:rPr>
+            </w:pPr>
+            <w:r>
+              <w:rPr>
+                <w:rFonts w:ascii="Arial Narrow" w:hAnsi="Arial Narrow"/>
+                <w:b/>
+                <w:bCs/>
+                <w:sz w:val="26"/>
+                <w:szCs w:val="26"/>
               </w:rPr>
               <w:t>YOY VARIANCE</w:t>
             </w:r>
@@ -3035,14 +3773,20 @@
           <w:p>
             <w:pPr>
               <w:rPr>
-                <w:b/>
-                <w:bCs/>
-              </w:rPr>
-            </w:pPr>
-            <w:r>
-              <w:rPr>
-                <w:b/>
-                <w:bCs/>
+                <w:rFonts w:ascii="Arial Narrow" w:hAnsi="Arial Narrow"/>
+                <w:b/>
+                <w:bCs/>
+                <w:sz w:val="26"/>
+                <w:szCs w:val="26"/>
+              </w:rPr>
+            </w:pPr>
+            <w:r>
+              <w:rPr>
+                <w:rFonts w:ascii="Arial Narrow" w:hAnsi="Arial Narrow"/>
+                <w:b/>
+                <w:bCs/>
+                <w:sz w:val="26"/>
+                <w:szCs w:val="26"/>
               </w:rPr>
               <w:t>{{NXP_value1}}</w:t>
             </w:r>
@@ -3065,14 +3809,20 @@
           <w:p>
             <w:pPr>
               <w:rPr>
-                <w:b/>
-                <w:bCs/>
-              </w:rPr>
-            </w:pPr>
-            <w:r>
-              <w:rPr>
-                <w:b/>
-                <w:bCs/>
+                <w:rFonts w:ascii="Arial Narrow" w:hAnsi="Arial Narrow"/>
+                <w:b/>
+                <w:bCs/>
+                <w:sz w:val="26"/>
+                <w:szCs w:val="26"/>
+              </w:rPr>
+            </w:pPr>
+            <w:r>
+              <w:rPr>
+                <w:rFonts w:ascii="Arial Narrow" w:hAnsi="Arial Narrow"/>
+                <w:b/>
+                <w:bCs/>
+                <w:sz w:val="26"/>
+                <w:szCs w:val="26"/>
               </w:rPr>
               <w:t>{{r NXP_value2_r}}</w:t>
             </w:r>
@@ -3095,14 +3845,20 @@
           <w:p>
             <w:pPr>
               <w:rPr>
-                <w:b/>
-                <w:bCs/>
-              </w:rPr>
-            </w:pPr>
-            <w:r>
-              <w:rPr>
-                <w:b/>
-                <w:bCs/>
+                <w:rFonts w:ascii="Arial Narrow" w:hAnsi="Arial Narrow"/>
+                <w:b/>
+                <w:bCs/>
+                <w:sz w:val="26"/>
+                <w:szCs w:val="26"/>
+              </w:rPr>
+            </w:pPr>
+            <w:r>
+              <w:rPr>
+                <w:rFonts w:ascii="Arial Narrow" w:hAnsi="Arial Narrow"/>
+                <w:b/>
+                <w:bCs/>
+                <w:sz w:val="26"/>
+                <w:szCs w:val="26"/>
               </w:rPr>
               <w:t>{{r NXP_value3_r}}</w:t>
             </w:r>
@@ -3123,7 +3879,19 @@
             </w:tcMar>
           </w:tcPr>
           <w:p>
-            <w:r>
+            <w:pPr>
+              <w:rPr>
+                <w:rFonts w:ascii="Arial Narrow" w:hAnsi="Arial Narrow"/>
+                <w:sz w:val="26"/>
+                <w:szCs w:val="26"/>
+              </w:rPr>
+            </w:pPr>
+            <w:r>
+              <w:rPr>
+                <w:rFonts w:ascii="Arial Narrow" w:hAnsi="Arial Narrow"/>
+                <w:sz w:val="26"/>
+                <w:szCs w:val="26"/>
+              </w:rPr>
               <w:t>{{r NXP_value4_r}}</w:t>
             </w:r>
           </w:p>
@@ -3146,6 +3914,11 @@
         </w:rPr>
       </w:pPr>
       <w:r>
+        <w:rPr>
+          <w:rFonts w:ascii="Arial Narrow" w:hAnsi="Arial Narrow"/>
+          <w:sz w:val="26"/>
+          <w:szCs w:val="26"/>
+        </w:rPr>
         <w:t>{{NXP_summary}}</w:t>
       </w:r>
     </w:p>
@@ -3204,6 +3977,11 @@
         </w:rPr>
       </w:pPr>
       <w:r>
+        <w:rPr>
+          <w:rFonts w:ascii="Arial Narrow" w:hAnsi="Arial Narrow"/>
+          <w:sz w:val="26"/>
+          <w:szCs w:val="26"/>
+        </w:rPr>
         <w:t>{{FINAL_summary_1}}</w:t>
       </w:r>
     </w:p>
@@ -3223,6 +4001,12 @@
         </w:rPr>
       </w:pPr>
       <w:r>
+        <w:rPr>
+          <w:rFonts w:ascii="Arial Narrow" w:hAnsi="Arial Narrow"/>
+          <w:sz w:val="26"/>
+          <w:szCs w:val="26"/>
+        </w:rPr>
+        <w:lastRenderedPageBreak/>
         <w:t>{{FINAL_summary_2}}</w:t>
       </w:r>
     </w:p>
@@ -3242,6 +4026,11 @@
         </w:rPr>
       </w:pPr>
       <w:r>
+        <w:rPr>
+          <w:rFonts w:ascii="Arial Narrow" w:hAnsi="Arial Narrow"/>
+          <w:sz w:val="26"/>
+          <w:szCs w:val="26"/>
+        </w:rPr>
         <w:t>{{FINAL_summary_3}}</w:t>
       </w:r>
     </w:p>

</xml_diff>